<commit_message>
Viz 2 : graphe radial par prénom (retour du groupe) + docs
</commit_message>
<xml_diff>
--- a/report/Final_Visualizations_Report.docx
+++ b/report/Final_Visualizations_Report.docx
@@ -69,7 +69,7 @@
       <w:r>
         <w:drawing>
           <wp:inline xmlns:a="http://schemas.openxmlformats.org/drawingml/2006/main" xmlns:pic="http://schemas.openxmlformats.org/drawingml/2006/picture">
-            <wp:extent cx="5669280" cy="3115519"/>
+            <wp:extent cx="5669280" cy="3366135"/>
             <wp:docPr id="1" name="Picture 1"/>
             <wp:cNvGraphicFramePr>
               <a:graphicFrameLocks noChangeAspect="1"/>
@@ -90,7 +90,7 @@
                   <pic:spPr>
                     <a:xfrm>
                       <a:off x="0" y="0"/>
-                      <a:ext cx="5669280" cy="3115519"/>
+                      <a:ext cx="5669280" cy="3366135"/>
                     </a:xfrm>
                     <a:prstGeom prst="rect"/>
                   </pic:spPr>
@@ -215,17 +215,22 @@
     </w:p>
     <w:p>
       <w:r>
+        <w:t>We use two complementary views: a per-name radial chart (the main answer) and a sunburst (demographic context).</w:t>
+      </w:r>
+    </w:p>
+    <w:p>
+      <w:r>
         <w:rPr>
           <w:b/>
           <w:color w:val="2E75B6"/>
           <w:sz w:val="23"/>
         </w:rPr>
-        <w:t>What it shows</w:t>
+        <w:t>Main view — radial chart of a name's local popularity</w:t>
       </w:r>
     </w:p>
     <w:p>
       <w:r>
-        <w:t>A two-ring sunburst of where births occur: the inner ring is the region, the outer ring its departments, and the angle of each arc is proportional to the number of births. The “Decade” slider recomposes the rings decade by decade; hovering a region highlights it and fades the rest.</w:t>
+        <w:t>Each department is a fixed-width angular sector, arranged in pseudo-geographic order (west on the left, east on the right, north on top), so the layout is always the same and recognizable. The radial length of a sector encodes the name's local popularity as a frequency — births per thousand in that department — normalized by the national rate, i.e. how many times more (or less) common the name is locally than nationally. A fixed dashed reference circle marks the national level (×1): a sector reaching beyond the circle means the name is over-represented there, inside means under-represented. A name selector (sorted by popularity) and a decade slider drive the chart; region codes label the ring and are repeated with full names in the legend.</w:t>
       </w:r>
     </w:p>
     <w:p>
@@ -235,7 +240,7 @@
       <w:r>
         <w:drawing>
           <wp:inline xmlns:a="http://schemas.openxmlformats.org/drawingml/2006/main" xmlns:pic="http://schemas.openxmlformats.org/drawingml/2006/picture">
-            <wp:extent cx="4572000" cy="3795386"/>
+            <wp:extent cx="5486400" cy="3839285"/>
             <wp:docPr id="2" name="Picture 2"/>
             <wp:cNvGraphicFramePr>
               <a:graphicFrameLocks noChangeAspect="1"/>
@@ -244,7 +249,7 @@
               <a:graphicData uri="http://schemas.openxmlformats.org/drawingml/2006/picture">
                 <pic:pic>
                   <pic:nvPicPr>
-                    <pic:cNvPr id="0" name="viz2_sunburst_preview.png"/>
+                    <pic:cNvPr id="0" name="viz2_radial_demo_ewen.png"/>
                     <pic:cNvPicPr/>
                   </pic:nvPicPr>
                   <pic:blipFill>
@@ -256,7 +261,7 @@
                   <pic:spPr>
                     <a:xfrm>
                       <a:off x="0" y="0"/>
-                      <a:ext cx="4572000" cy="3795386"/>
+                      <a:ext cx="5486400" cy="3839285"/>
                     </a:xfrm>
                     <a:prstGeom prst="rect"/>
                   </pic:spPr>
@@ -295,7 +300,7 @@
         <w:pStyle w:val="ListBullet"/>
       </w:pPr>
       <w:r>
-        <w:t>It gives the geographic structure of the data in one part-to-whole picture: which regions and departments carry the most births (e.g. Île-de-France and Rhône-Alpes dominate).</w:t>
+        <w:t>Frequency-normalized length removes the population-size bias: Paris (75) is no longer automatically ‘biggest’; we compare like with like.</w:t>
       </w:r>
     </w:p>
     <w:p>
@@ -303,7 +308,7 @@
         <w:pStyle w:val="ListBullet"/>
       </w:pPr>
       <w:r>
-        <w:t>The decade slider exposes regional shifts over time — the demographic weight of regions is not constant across the century.</w:t>
+        <w:t>The fixed ×1 reference circle turns the regional question into a one-glance read: bars beyond the circle = locally more popular, bars inside = less.</w:t>
       </w:r>
     </w:p>
     <w:p>
@@ -311,7 +316,7 @@
         <w:pStyle w:val="ListBullet"/>
       </w:pPr>
       <w:r>
-        <w:t>Hover-to-highlight makes a single region and its departments easy to isolate and compare.</w:t>
+        <w:t>It answers both sub-questions directly — a regional name (Breton EWEN) makes the western sectors shoot past the circle while everywhere else stays inside; a top national name (EMMA) produces near-uniform bars hugging the circle everywhere (popular across the whole country).</w:t>
       </w:r>
     </w:p>
     <w:p>
@@ -319,7 +324,7 @@
         <w:pStyle w:val="ListBullet"/>
       </w:pPr>
       <w:r>
-        <w:t>It establishes the regional baseline needed to interpret any name: how many births each region contributes in the first place.</w:t>
+        <w:t>The stable geographic ordering lets the eye learn the layout once and then compare any name; the decade slider shows how a name's geography appears, spreads or fades over time.</w:t>
       </w:r>
     </w:p>
     <w:p>
@@ -329,12 +334,98 @@
           <w:color w:val="2E75B6"/>
           <w:sz w:val="23"/>
         </w:rPr>
-        <w:t>Honest limitation &amp; complementary view (compare/contrast)</w:t>
+        <w:t>Complementary view — sunburst of births by region and department</w:t>
       </w:r>
     </w:p>
     <w:p>
       <w:r>
-        <w:t>The sunburst answers “how are births distributed across regions?” but not, on its own, “is a given name unusually popular in a region?” To fully answer the regional question we pair it with a choropleth map of the location quotient (local share ÷ national share) with a name selector and year slider. Together they show that regional names (Breton EWEN, Catalan JORDI, Basque-area MAYLIS…) light up locally, whereas top national names (EMMA, LUCAS) stay uniform everywhere — which is exactly the second sub-question. The sunburst supplies the ‘how big is each region’ context; the choropleth supplies the ‘where is this name over-represented’ answer.</w:t>
+        <w:t>The sunburst (inner ring = region, outer ring = departments, angle = number of births, decade slider) gives the demographic context the radial chart abstracts away: how many births each region actually contributes, and how that weight shifts across decades. It is the ‘how big is each region’ overview; the radial chart is the ‘where is this name over-represented’ detail.</w:t>
+      </w:r>
+    </w:p>
+    <w:p>
+      <w:pPr>
+        <w:jc w:val="center"/>
+      </w:pPr>
+      <w:r>
+        <w:drawing>
+          <wp:inline xmlns:a="http://schemas.openxmlformats.org/drawingml/2006/main" xmlns:pic="http://schemas.openxmlformats.org/drawingml/2006/picture">
+            <wp:extent cx="4023360" cy="3339940"/>
+            <wp:docPr id="3" name="Picture 3"/>
+            <wp:cNvGraphicFramePr>
+              <a:graphicFrameLocks noChangeAspect="1"/>
+            </wp:cNvGraphicFramePr>
+            <a:graphic>
+              <a:graphicData uri="http://schemas.openxmlformats.org/drawingml/2006/picture">
+                <pic:pic>
+                  <pic:nvPicPr>
+                    <pic:cNvPr id="0" name="viz2_sunburst_preview.png"/>
+                    <pic:cNvPicPr/>
+                  </pic:nvPicPr>
+                  <pic:blipFill>
+                    <a:blip r:embed="rId11"/>
+                    <a:stretch>
+                      <a:fillRect/>
+                    </a:stretch>
+                  </pic:blipFill>
+                  <pic:spPr>
+                    <a:xfrm>
+                      <a:off x="0" y="0"/>
+                      <a:ext cx="4023360" cy="3339940"/>
+                    </a:xfrm>
+                    <a:prstGeom prst="rect"/>
+                  </pic:spPr>
+                </pic:pic>
+              </a:graphicData>
+            </a:graphic>
+          </wp:inline>
+        </w:drawing>
+      </w:r>
+    </w:p>
+    <w:p>
+      <w:pPr>
+        <w:jc w:val="center"/>
+      </w:pPr>
+      <w:r>
+        <w:rPr>
+          <w:i/>
+          <w:color w:val="808080"/>
+          <w:sz w:val="17"/>
+        </w:rPr>
+        <w:t>Static snapshot — the live HTML adds the slider, hover and linked views.</w:t>
+      </w:r>
+    </w:p>
+    <w:p>
+      <w:r>
+        <w:rPr>
+          <w:b/>
+          <w:color w:val="2E75B6"/>
+          <w:sz w:val="23"/>
+        </w:rPr>
+        <w:t>Key points to demonstrate (screenshots / video)</w:t>
+      </w:r>
+    </w:p>
+    <w:p>
+      <w:pPr>
+        <w:pStyle w:val="ListBullet"/>
+      </w:pPr>
+      <w:r>
+        <w:t>Radial chart with a regional name (EWEN/JORDI/MAYLIS) — western/southern sectors past the circle.</w:t>
+      </w:r>
+    </w:p>
+    <w:p>
+      <w:pPr>
+        <w:pStyle w:val="ListBullet"/>
+      </w:pPr>
+      <w:r>
+        <w:t>Radial chart with a national name (EMMA/LUCAS) — uniform bars on the reference circle.</w:t>
+      </w:r>
+    </w:p>
+    <w:p>
+      <w:pPr>
+        <w:pStyle w:val="ListBullet"/>
+      </w:pPr>
+      <w:r>
+        <w:t>A short clip changing the name in the selector to show the pattern reshaping.</w:t>
       </w:r>
     </w:p>
     <w:p>
@@ -375,7 +466,7 @@
         <w:drawing>
           <wp:inline xmlns:a="http://schemas.openxmlformats.org/drawingml/2006/main" xmlns:pic="http://schemas.openxmlformats.org/drawingml/2006/picture">
             <wp:extent cx="5669280" cy="3285488"/>
-            <wp:docPr id="3" name="Picture 3"/>
+            <wp:docPr id="4" name="Picture 4"/>
             <wp:cNvGraphicFramePr>
               <a:graphicFrameLocks noChangeAspect="1"/>
             </wp:cNvGraphicFramePr>
@@ -387,7 +478,7 @@
                     <pic:cNvPicPr/>
                   </pic:nvPicPr>
                   <pic:blipFill>
-                    <a:blip r:embed="rId11"/>
+                    <a:blip r:embed="rId12"/>
                     <a:stretch>
                       <a:fillRect/>
                     </a:stretch>
@@ -507,7 +598,7 @@
     </w:p>
     <w:p>
       <w:r>
-        <w:t>Each visualization is matched to its question through a deliberate encoding: longevity on an axis for time, geographic arcs (plus a location-quotient map) for region, and a diverging female-share heatmap for gender. All three follow the same overview + detail-on-demand pattern (slider / hover / linked view) and share a consistent, accessible color language.</w:t>
+        <w:t>Each visualization is matched to its question through a deliberate encoding: longevity on an axis for time, a frequency-normalized radial chart with a national reference circle (plus a sunburst for demographic context) for region, and a diverging female-share heatmap for gender. All three follow the same overview + detail-on-demand pattern (slider / hover / linked view) and share a consistent, accessible color language.</w:t>
       </w:r>
     </w:p>
     <w:sectPr>

</xml_diff>